<commit_message>
Book 5: clarify spectrum licensing rules and refresh KPF
</commit_message>
<xml_diff>
--- a/EE - SERIES/Communications_Wireless_and_SDR_Book5.docx
+++ b/EE - SERIES/Communications_Wireless_and_SDR_Book5.docx
@@ -5308,13 +5308,7 @@
     </w:p>
     <w:p>
       <w:r>
-        <w:t>Wi-Fi uses unlicensed spectrum: anyone may transmit, within power and etiquette rules, and the cost is that nobody is protected from anyone else. Cellular uses licensed spectrum, bought at auction for exclusive use in a region, plus some unlicensed operation called NR-U. The two share physics and do not share regulators. The 2.4 GHz band, 2400 to 2483.5 MHz, is 83.5 MHz wide and holds only three non-overlapping 20 MHz channels, 1, 6, and 11, shared with Bluetooth, microwave ovens, and much else. It is crowd</w:t>
-      </w:r>
-      <w:r>
-        <w:t>ed. The 5 GHz band, with several hundred megahertz depending on the country, is the workhorse of Wi-Fi 5 and 6, with 80 and 160 MHz channels.</w:t>
-      </w:r>
-      <w:r>
-        <w:t xml:space="preserve"> This chapter is a 2026 snapshot; verify current national allocations and operating rules before transmitting.</w:t>
+        <w:t>Wi-Fi in the bands discussed here operates under license-exempt rules: compliant devices may transmit without an individual spectrum license, subject to band-specific power, equipment, and sharing limits, and must tolerate interference from other authorized users. Cellular networks often use licensed spectrum; the applicable license and service rules define the permitted service, area, and interference rights, and licensing mechanisms vary by band. 5G NR also supports unlicensed operation called NR-U. Both systems use the same RF physics but operate under different authorization and interference rules. The 2.4 GHz band, 2400 to 2483.5 MHz, is 83.5 MHz wide and holds only three non-overlapping 20 MHz channels, 1, 6, and 11, shared with Bluetooth, microwave ovens, and much else. It is crowded. The 5 GHz band, with several hundred megahertz depending on the country, is the workhorse of Wi-Fi 5 and 6, with 80 and 160 MHz channels. This chapter is a 2026 snapshot; verify current national allocations and operating rules before transmitting.</w:t>
       </w:r>
     </w:p>
     <w:p>

</xml_diff>

<commit_message>
Book 5: clarify zero-IF error and remedies
</commit_message>
<xml_diff>
--- a/EE - SERIES/Communications_Wireless_and_SDR_Book5.docx
+++ b/EE - SERIES/Communications_Wireless_and_SDR_Book5.docx
@@ -1376,10 +1376,13 @@
     </w:p>
     <w:p>
       <w:r>
-        <w:t>The zero-IF receiver of Chapter 8 mixes the carrier straight to 0 Hz. Any local-oscillator energy that leaks back to the antenna and re-enters the mixer is mixed with itself and appears as a DC offset, often millivolts at the mixer output when the wanted signal is microvolts. Second-order intermodulation from a strong neighbor also lands at DC. Integrated transceivers such as the AD9361 run continuous DC-offset and quadrature-tracking loops for this reason, and OFDM standards leave the center subcarrier emp</w:t>
-      </w:r>
-      <w:r>
-        <w:t>ty so that the residual offset falls where no data are. A low-IF receiver moves the wanted signal a few hundred kilohertz off zero, which avoids the DC problem at the price of a stricter image rejection.</w:t>
+        <w:t>The zero-IF receiver of Chapter 8 mixes the carrier directly to 0 Hz. If local-oscillator energy leaks to the antenna and re-enters the mixer, it mixes with itself and appears as a DC offset. This can be millivolts at the mixer output even when the wanted signal is only microvolts. A strong neighboring signal can also produce second-order intermodulation at DC.</w:t>
+      </w:r>
+    </w:p>
+    <w:p>
+      <w:pPr/>
+      <w:r>
+        <w:t>Integrated transceivers such as the AD9361 run continuous DC-offset and quadrature-tracking loops. OFDM standards leave the center subcarrier empty so residual offset falls where no data are carried. A low-IF receiver moves the wanted signal a few hundred kilohertz away from zero, avoiding the DC problem but requiring stricter image rejection.</w:t>
       </w:r>
     </w:p>
     <w:p>

</xml_diff>